<commit_message>
feat: add web-based user management console (/admin/users)
- Add GET/POST/DELETE routes under /admin/users (admin role only)
- Inline HTMX row edit for role changes and password resets
- Safety guards: cannot delete self or last admin account
- Add require_admin FastAPI dependency to auth.py
- 15 integration tests (686 total, all passing)
- Update README User Management section with web UI instructions
- Add Section 22 (User Management) to operator guide generator
- Add /admin/* endpoints to appendix API reference

Co-Authored-By: Claude Sonnet 4.6 <noreply@anthropic.com>
</commit_message>
<xml_diff>
--- a/docs/SPECTRE_Operator_Guide.docx
+++ b/docs/SPECTRE_Operator_Guide.docx
@@ -145,7 +145,7 @@
                 <w:color w:val="002244"/>
                 <w:sz w:val="36"/>
               </w:rPr>
-              <w:t>21</w:t>
+              <w:t>22</w:t>
             </w:r>
           </w:p>
         </w:tc>
@@ -20920,7 +20920,7 @@
                 <w:color w:val="2C3E50"/>
                 <w:sz w:val="18"/>
               </w:rPr>
-              <w:t>POST</w:t>
+              <w:t>GET</w:t>
             </w:r>
           </w:p>
         </w:tc>
@@ -20936,7 +20936,7 @@
                 <w:color w:val="2C3E50"/>
                 <w:sz w:val="18"/>
               </w:rPr>
-              <w:t>/udl/login</w:t>
+              <w:t>/admin/users</w:t>
             </w:r>
           </w:p>
         </w:tc>
@@ -20952,7 +20952,7 @@
                 <w:color w:val="2C3E50"/>
                 <w:sz w:val="18"/>
               </w:rPr>
-              <w:t>Connect to UDL with credentials</w:t>
+              <w:t>List all users (admin only)</w:t>
             </w:r>
           </w:p>
         </w:tc>
@@ -20988,7 +20988,7 @@
                 <w:color w:val="2C3E50"/>
                 <w:sz w:val="18"/>
               </w:rPr>
-              <w:t>/udl/logout</w:t>
+              <w:t>/admin/users</w:t>
             </w:r>
           </w:p>
         </w:tc>
@@ -21005,7 +21005,7 @@
                 <w:color w:val="2C3E50"/>
                 <w:sz w:val="18"/>
               </w:rPr>
-              <w:t>Disconnect from UDL</w:t>
+              <w:t>Create a new user (admin only)</w:t>
             </w:r>
           </w:p>
         </w:tc>
@@ -21023,7 +21023,7 @@
                 <w:color w:val="2C3E50"/>
                 <w:sz w:val="18"/>
               </w:rPr>
-              <w:t>POST</w:t>
+              <w:t>GET</w:t>
             </w:r>
           </w:p>
         </w:tc>
@@ -21039,7 +21039,7 @@
                 <w:color w:val="2C3E50"/>
                 <w:sz w:val="18"/>
               </w:rPr>
-              <w:t>/udl/data-mode</w:t>
+              <w:t>/admin/users/{id}/edit</w:t>
             </w:r>
           </w:p>
         </w:tc>
@@ -21055,7 +21055,7 @@
                 <w:color w:val="2C3E50"/>
                 <w:sz w:val="18"/>
               </w:rPr>
-              <w:t>Set session UDL data mode</w:t>
+              <w:t>Open inline edit form for a user (admin only)</w:t>
             </w:r>
           </w:p>
         </w:tc>
@@ -21074,7 +21074,7 @@
                 <w:color w:val="2C3E50"/>
                 <w:sz w:val="18"/>
               </w:rPr>
-              <w:t>POST</w:t>
+              <w:t>GET</w:t>
             </w:r>
           </w:p>
         </w:tc>
@@ -21091,7 +21091,7 @@
                 <w:color w:val="2C3E50"/>
                 <w:sz w:val="18"/>
               </w:rPr>
-              <w:t>/udl/tle-source</w:t>
+              <w:t>/admin/users/{id}/cancel</w:t>
             </w:r>
           </w:p>
         </w:tc>
@@ -21108,7 +21108,7 @@
                 <w:color w:val="2C3E50"/>
                 <w:sz w:val="18"/>
               </w:rPr>
-              <w:t>Set preferred TLE source provider</w:t>
+              <w:t>Cancel inline edit, return display row (admin only)</w:t>
             </w:r>
           </w:p>
         </w:tc>
@@ -21126,7 +21126,7 @@
                 <w:color w:val="2C3E50"/>
                 <w:sz w:val="18"/>
               </w:rPr>
-              <w:t>GET</w:t>
+              <w:t>POST</w:t>
             </w:r>
           </w:p>
         </w:tc>
@@ -21142,7 +21142,7 @@
                 <w:color w:val="2C3E50"/>
                 <w:sz w:val="18"/>
               </w:rPr>
-              <w:t>/udl/tle</w:t>
+              <w:t>/admin/users/{id}</w:t>
             </w:r>
           </w:p>
         </w:tc>
@@ -21158,7 +21158,7 @@
                 <w:color w:val="2C3E50"/>
                 <w:sz w:val="18"/>
               </w:rPr>
-              <w:t>Fetch TLE from UDL by NORAD ID (latest or epoch mode)</w:t>
+              <w:t>Save role / password change for a user (admin only)</w:t>
             </w:r>
           </w:p>
         </w:tc>
@@ -21177,7 +21177,7 @@
                 <w:color w:val="2C3E50"/>
                 <w:sz w:val="18"/>
               </w:rPr>
-              <w:t>GET</w:t>
+              <w:t>DELETE</w:t>
             </w:r>
           </w:p>
         </w:tc>
@@ -21194,7 +21194,7 @@
                 <w:color w:val="2C3E50"/>
                 <w:sz w:val="18"/>
               </w:rPr>
-              <w:t>/udl/statevector</w:t>
+              <w:t>/admin/users/{id}</w:t>
             </w:r>
           </w:p>
         </w:tc>
@@ -21211,7 +21211,7 @@
                 <w:color w:val="2C3E50"/>
                 <w:sz w:val="18"/>
               </w:rPr>
-              <w:t>Fetch latest Cartesian state vector from UDL</w:t>
+              <w:t>Delete a user account (admin only)</w:t>
             </w:r>
           </w:p>
         </w:tc>
@@ -21229,7 +21229,7 @@
                 <w:color w:val="2C3E50"/>
                 <w:sz w:val="18"/>
               </w:rPr>
-              <w:t>GET</w:t>
+              <w:t>POST</w:t>
             </w:r>
           </w:p>
         </w:tc>
@@ -21245,7 +21245,7 @@
                 <w:color w:val="2C3E50"/>
                 <w:sz w:val="18"/>
               </w:rPr>
-              <w:t>/udl/hrr</w:t>
+              <w:t>/udl/login</w:t>
             </w:r>
           </w:p>
         </w:tc>
@@ -21261,7 +21261,7 @@
                 <w:color w:val="2C3E50"/>
                 <w:sz w:val="18"/>
               </w:rPr>
-              <w:t>Fetch HRR satellite list from UDL</w:t>
+              <w:t>Connect to UDL with credentials</w:t>
             </w:r>
           </w:p>
         </w:tc>
@@ -21280,7 +21280,7 @@
                 <w:color w:val="2C3E50"/>
                 <w:sz w:val="18"/>
               </w:rPr>
-              <w:t>GET</w:t>
+              <w:t>POST</w:t>
             </w:r>
           </w:p>
         </w:tc>
@@ -21297,7 +21297,7 @@
                 <w:color w:val="2C3E50"/>
                 <w:sz w:val="18"/>
               </w:rPr>
-              <w:t>/udl/catalog/search</w:t>
+              <w:t>/udl/logout</w:t>
             </w:r>
           </w:p>
         </w:tc>
@@ -21314,12 +21314,881 @@
                 <w:color w:val="2C3E50"/>
                 <w:sz w:val="18"/>
               </w:rPr>
+              <w:t>Disconnect from UDL</w:t>
+            </w:r>
+          </w:p>
+        </w:tc>
+      </w:tr>
+      <w:tr>
+        <w:tc>
+          <w:tcPr>
+            <w:tcW w:type="dxa" w:w="3210"/>
+          </w:tcPr>
+          <w:p>
+            <w:r/>
+            <w:r>
+              <w:rPr>
+                <w:rFonts w:ascii="Segoe UI" w:hAnsi="Segoe UI"/>
+                <w:color w:val="2C3E50"/>
+                <w:sz w:val="18"/>
+              </w:rPr>
+              <w:t>POST</w:t>
+            </w:r>
+          </w:p>
+        </w:tc>
+        <w:tc>
+          <w:tcPr>
+            <w:tcW w:type="dxa" w:w="3210"/>
+          </w:tcPr>
+          <w:p>
+            <w:r/>
+            <w:r>
+              <w:rPr>
+                <w:rFonts w:ascii="Segoe UI" w:hAnsi="Segoe UI"/>
+                <w:color w:val="2C3E50"/>
+                <w:sz w:val="18"/>
+              </w:rPr>
+              <w:t>/udl/data-mode</w:t>
+            </w:r>
+          </w:p>
+        </w:tc>
+        <w:tc>
+          <w:tcPr>
+            <w:tcW w:type="dxa" w:w="3210"/>
+          </w:tcPr>
+          <w:p>
+            <w:r/>
+            <w:r>
+              <w:rPr>
+                <w:rFonts w:ascii="Segoe UI" w:hAnsi="Segoe UI"/>
+                <w:color w:val="2C3E50"/>
+                <w:sz w:val="18"/>
+              </w:rPr>
+              <w:t>Set session UDL data mode</w:t>
+            </w:r>
+          </w:p>
+        </w:tc>
+      </w:tr>
+      <w:tr>
+        <w:tc>
+          <w:tcPr>
+            <w:tcW w:type="dxa" w:w="3210"/>
+            <w:shd w:fill="F5F7FA" w:val="clear"/>
+          </w:tcPr>
+          <w:p>
+            <w:r/>
+            <w:r>
+              <w:rPr>
+                <w:rFonts w:ascii="Segoe UI" w:hAnsi="Segoe UI"/>
+                <w:color w:val="2C3E50"/>
+                <w:sz w:val="18"/>
+              </w:rPr>
+              <w:t>POST</w:t>
+            </w:r>
+          </w:p>
+        </w:tc>
+        <w:tc>
+          <w:tcPr>
+            <w:tcW w:type="dxa" w:w="3210"/>
+            <w:shd w:fill="F5F7FA" w:val="clear"/>
+          </w:tcPr>
+          <w:p>
+            <w:r/>
+            <w:r>
+              <w:rPr>
+                <w:rFonts w:ascii="Segoe UI" w:hAnsi="Segoe UI"/>
+                <w:color w:val="2C3E50"/>
+                <w:sz w:val="18"/>
+              </w:rPr>
+              <w:t>/udl/tle-source</w:t>
+            </w:r>
+          </w:p>
+        </w:tc>
+        <w:tc>
+          <w:tcPr>
+            <w:tcW w:type="dxa" w:w="3210"/>
+            <w:shd w:fill="F5F7FA" w:val="clear"/>
+          </w:tcPr>
+          <w:p>
+            <w:r/>
+            <w:r>
+              <w:rPr>
+                <w:rFonts w:ascii="Segoe UI" w:hAnsi="Segoe UI"/>
+                <w:color w:val="2C3E50"/>
+                <w:sz w:val="18"/>
+              </w:rPr>
+              <w:t>Set preferred TLE source provider</w:t>
+            </w:r>
+          </w:p>
+        </w:tc>
+      </w:tr>
+      <w:tr>
+        <w:tc>
+          <w:tcPr>
+            <w:tcW w:type="dxa" w:w="3210"/>
+          </w:tcPr>
+          <w:p>
+            <w:r/>
+            <w:r>
+              <w:rPr>
+                <w:rFonts w:ascii="Segoe UI" w:hAnsi="Segoe UI"/>
+                <w:color w:val="2C3E50"/>
+                <w:sz w:val="18"/>
+              </w:rPr>
+              <w:t>GET</w:t>
+            </w:r>
+          </w:p>
+        </w:tc>
+        <w:tc>
+          <w:tcPr>
+            <w:tcW w:type="dxa" w:w="3210"/>
+          </w:tcPr>
+          <w:p>
+            <w:r/>
+            <w:r>
+              <w:rPr>
+                <w:rFonts w:ascii="Segoe UI" w:hAnsi="Segoe UI"/>
+                <w:color w:val="2C3E50"/>
+                <w:sz w:val="18"/>
+              </w:rPr>
+              <w:t>/udl/tle</w:t>
+            </w:r>
+          </w:p>
+        </w:tc>
+        <w:tc>
+          <w:tcPr>
+            <w:tcW w:type="dxa" w:w="3210"/>
+          </w:tcPr>
+          <w:p>
+            <w:r/>
+            <w:r>
+              <w:rPr>
+                <w:rFonts w:ascii="Segoe UI" w:hAnsi="Segoe UI"/>
+                <w:color w:val="2C3E50"/>
+                <w:sz w:val="18"/>
+              </w:rPr>
+              <w:t>Fetch TLE from UDL by NORAD ID (latest or epoch mode)</w:t>
+            </w:r>
+          </w:p>
+        </w:tc>
+      </w:tr>
+      <w:tr>
+        <w:tc>
+          <w:tcPr>
+            <w:tcW w:type="dxa" w:w="3210"/>
+            <w:shd w:fill="F5F7FA" w:val="clear"/>
+          </w:tcPr>
+          <w:p>
+            <w:r/>
+            <w:r>
+              <w:rPr>
+                <w:rFonts w:ascii="Segoe UI" w:hAnsi="Segoe UI"/>
+                <w:color w:val="2C3E50"/>
+                <w:sz w:val="18"/>
+              </w:rPr>
+              <w:t>GET</w:t>
+            </w:r>
+          </w:p>
+        </w:tc>
+        <w:tc>
+          <w:tcPr>
+            <w:tcW w:type="dxa" w:w="3210"/>
+            <w:shd w:fill="F5F7FA" w:val="clear"/>
+          </w:tcPr>
+          <w:p>
+            <w:r/>
+            <w:r>
+              <w:rPr>
+                <w:rFonts w:ascii="Segoe UI" w:hAnsi="Segoe UI"/>
+                <w:color w:val="2C3E50"/>
+                <w:sz w:val="18"/>
+              </w:rPr>
+              <w:t>/udl/statevector</w:t>
+            </w:r>
+          </w:p>
+        </w:tc>
+        <w:tc>
+          <w:tcPr>
+            <w:tcW w:type="dxa" w:w="3210"/>
+            <w:shd w:fill="F5F7FA" w:val="clear"/>
+          </w:tcPr>
+          <w:p>
+            <w:r/>
+            <w:r>
+              <w:rPr>
+                <w:rFonts w:ascii="Segoe UI" w:hAnsi="Segoe UI"/>
+                <w:color w:val="2C3E50"/>
+                <w:sz w:val="18"/>
+              </w:rPr>
+              <w:t>Fetch latest Cartesian state vector from UDL</w:t>
+            </w:r>
+          </w:p>
+        </w:tc>
+      </w:tr>
+      <w:tr>
+        <w:tc>
+          <w:tcPr>
+            <w:tcW w:type="dxa" w:w="3210"/>
+          </w:tcPr>
+          <w:p>
+            <w:r/>
+            <w:r>
+              <w:rPr>
+                <w:rFonts w:ascii="Segoe UI" w:hAnsi="Segoe UI"/>
+                <w:color w:val="2C3E50"/>
+                <w:sz w:val="18"/>
+              </w:rPr>
+              <w:t>GET</w:t>
+            </w:r>
+          </w:p>
+        </w:tc>
+        <w:tc>
+          <w:tcPr>
+            <w:tcW w:type="dxa" w:w="3210"/>
+          </w:tcPr>
+          <w:p>
+            <w:r/>
+            <w:r>
+              <w:rPr>
+                <w:rFonts w:ascii="Segoe UI" w:hAnsi="Segoe UI"/>
+                <w:color w:val="2C3E50"/>
+                <w:sz w:val="18"/>
+              </w:rPr>
+              <w:t>/udl/hrr</w:t>
+            </w:r>
+          </w:p>
+        </w:tc>
+        <w:tc>
+          <w:tcPr>
+            <w:tcW w:type="dxa" w:w="3210"/>
+          </w:tcPr>
+          <w:p>
+            <w:r/>
+            <w:r>
+              <w:rPr>
+                <w:rFonts w:ascii="Segoe UI" w:hAnsi="Segoe UI"/>
+                <w:color w:val="2C3E50"/>
+                <w:sz w:val="18"/>
+              </w:rPr>
+              <w:t>Fetch HRR satellite list from UDL</w:t>
+            </w:r>
+          </w:p>
+        </w:tc>
+      </w:tr>
+      <w:tr>
+        <w:tc>
+          <w:tcPr>
+            <w:tcW w:type="dxa" w:w="3210"/>
+            <w:shd w:fill="F5F7FA" w:val="clear"/>
+          </w:tcPr>
+          <w:p>
+            <w:r/>
+            <w:r>
+              <w:rPr>
+                <w:rFonts w:ascii="Segoe UI" w:hAnsi="Segoe UI"/>
+                <w:color w:val="2C3E50"/>
+                <w:sz w:val="18"/>
+              </w:rPr>
+              <w:t>GET</w:t>
+            </w:r>
+          </w:p>
+        </w:tc>
+        <w:tc>
+          <w:tcPr>
+            <w:tcW w:type="dxa" w:w="3210"/>
+            <w:shd w:fill="F5F7FA" w:val="clear"/>
+          </w:tcPr>
+          <w:p>
+            <w:r/>
+            <w:r>
+              <w:rPr>
+                <w:rFonts w:ascii="Segoe UI" w:hAnsi="Segoe UI"/>
+                <w:color w:val="2C3E50"/>
+                <w:sz w:val="18"/>
+              </w:rPr>
+              <w:t>/udl/catalog/search</w:t>
+            </w:r>
+          </w:p>
+        </w:tc>
+        <w:tc>
+          <w:tcPr>
+            <w:tcW w:type="dxa" w:w="3210"/>
+            <w:shd w:fill="F5F7FA" w:val="clear"/>
+          </w:tcPr>
+          <w:p>
+            <w:r/>
+            <w:r>
+              <w:rPr>
+                <w:rFonts w:ascii="Segoe UI" w:hAnsi="Segoe UI"/>
+                <w:color w:val="2C3E50"/>
+                <w:sz w:val="18"/>
+              </w:rPr>
               <w:t>Search cached on-orbit catalogue</w:t>
             </w:r>
           </w:p>
         </w:tc>
       </w:tr>
     </w:tbl>
+    <w:p>
+      <w:r>
+        <w:br w:type="page"/>
+      </w:r>
+    </w:p>
+    <w:p>
+      <w:pPr>
+        <w:spacing w:before="240" w:after="40"/>
+      </w:pPr>
+      <w:r>
+        <w:rPr>
+          <w:rFonts w:ascii="Segoe UI" w:hAnsi="Segoe UI"/>
+          <w:b/>
+          <w:color w:val="C8A415"/>
+          <w:sz w:val="18"/>
+        </w:rPr>
+        <w:t>SECTION 22</w:t>
+      </w:r>
+    </w:p>
+    <w:p>
+      <w:pPr>
+        <w:spacing w:before="360" w:after="160"/>
+      </w:pPr>
+      <w:r>
+        <w:rPr>
+          <w:rFonts w:ascii="Segoe UI" w:hAnsi="Segoe UI"/>
+          <w:b/>
+          <w:color w:val="002244"/>
+          <w:sz w:val="40"/>
+        </w:rPr>
+        <w:t>User Management</w:t>
+      </w:r>
+    </w:p>
+    <w:p>
+      <w:r>
+        <w:rPr>
+          <w:rFonts w:ascii="Segoe UI" w:hAnsi="Segoe UI"/>
+          <w:color w:val="2C3E50"/>
+          <w:sz w:val="20"/>
+        </w:rPr>
+        <w:t>SPECTRE provides a web-based user management console at /admin/users. This interface is restricted to accounts with the admin role. Operators do not have access to this area.</w:t>
+      </w:r>
+    </w:p>
+    <w:p>
+      <w:pPr>
+        <w:spacing w:before="280" w:after="120"/>
+        <w:pBdr>
+          <w:bottom w:val="single" w:sz="6" w:space="1" w:color="C8A415"/>
+        </w:pBdr>
+      </w:pPr>
+      <w:r>
+        <w:rPr>
+          <w:rFonts w:ascii="Segoe UI" w:hAnsi="Segoe UI"/>
+          <w:b/>
+          <w:color w:val="002244"/>
+          <w:sz w:val="32"/>
+        </w:rPr>
+        <w:t>Accessing the Admin Console</w:t>
+      </w:r>
+    </w:p>
+    <w:p>
+      <w:r>
+        <w:rPr>
+          <w:rFonts w:ascii="Segoe UI" w:hAnsi="Segoe UI"/>
+          <w:color w:val="2C3E50"/>
+          <w:sz w:val="20"/>
+        </w:rPr>
+        <w:t>Navigate to /admin/users in your browser while logged in as an admin. Non-admin accounts receive an HTTP 403 Forbidden response. Unauthenticated sessions are redirected to the login page.</w:t>
+      </w:r>
+    </w:p>
+    <w:tbl>
+      <w:tblPr>
+        <w:tblW w:type="auto" w:w="0"/>
+        <w:jc w:val="center"/>
+        <w:tblLook w:firstColumn="1" w:firstRow="1" w:lastColumn="0" w:lastRow="0" w:noHBand="0" w:noVBand="1" w:val="04A0"/>
+      </w:tblPr>
+      <w:tblGrid>
+        <w:gridCol w:w="9630"/>
+      </w:tblGrid>
+      <w:tr>
+        <w:tc>
+          <w:tcPr>
+            <w:tcW w:type="dxa" w:w="9630"/>
+            <w:shd w:fill="FFF9E6" w:val="clear"/>
+            <w:tcBorders>
+              <w:left w:val="single" w:sz="18" w:color="C8A415" w:space="0"/>
+              <w:top w:val="none" w:sz="0" w:space="0" w:color="auto"/>
+              <w:bottom w:val="none" w:sz="0" w:space="0" w:color="auto"/>
+              <w:right w:val="none" w:sz="0" w:space="0" w:color="auto"/>
+            </w:tcBorders>
+          </w:tcPr>
+          <w:p>
+            <w:r/>
+            <w:r>
+              <w:rPr>
+                <w:rFonts w:ascii="Segoe UI" w:hAnsi="Segoe UI"/>
+                <w:i/>
+                <w:color w:val="2C3E50"/>
+                <w:sz w:val="19"/>
+              </w:rPr>
+              <w:t>The bootstrap admin account is created from the SPECTRE_ADMIN_USER and SPECTRE_ADMIN_PASS environment variables on first run (only if the users table is empty). Set these before starting the server for the first time.</w:t>
+            </w:r>
+          </w:p>
+        </w:tc>
+      </w:tr>
+    </w:tbl>
+    <w:p>
+      <w:pPr>
+        <w:spacing w:before="280" w:after="120"/>
+        <w:pBdr>
+          <w:bottom w:val="single" w:sz="6" w:space="1" w:color="C8A415"/>
+        </w:pBdr>
+      </w:pPr>
+      <w:r>
+        <w:rPr>
+          <w:rFonts w:ascii="Segoe UI" w:hAnsi="Segoe UI"/>
+          <w:b/>
+          <w:color w:val="002244"/>
+          <w:sz w:val="32"/>
+        </w:rPr>
+        <w:t>User Roles</w:t>
+      </w:r>
+    </w:p>
+    <w:tbl>
+      <w:tblPr>
+        <w:tblW w:type="auto" w:w="0"/>
+        <w:jc w:val="center"/>
+        <w:tblLook w:firstColumn="1" w:firstRow="1" w:lastColumn="0" w:lastRow="0" w:noHBand="0" w:noVBand="1" w:val="04A0"/>
+      </w:tblPr>
+      <w:tblGrid>
+        <w:gridCol w:w="4815"/>
+        <w:gridCol w:w="4815"/>
+      </w:tblGrid>
+      <w:tr>
+        <w:tc>
+          <w:tcPr>
+            <w:tcW w:type="dxa" w:w="4815"/>
+            <w:shd w:fill="002244" w:val="clear"/>
+          </w:tcPr>
+          <w:p>
+            <w:r/>
+            <w:r>
+              <w:rPr>
+                <w:rFonts w:ascii="Segoe UI" w:hAnsi="Segoe UI"/>
+                <w:b/>
+                <w:color w:val="FFFFFF"/>
+                <w:sz w:val="18"/>
+              </w:rPr>
+              <w:t>Role</w:t>
+            </w:r>
+          </w:p>
+        </w:tc>
+        <w:tc>
+          <w:tcPr>
+            <w:tcW w:type="dxa" w:w="4815"/>
+            <w:shd w:fill="002244" w:val="clear"/>
+          </w:tcPr>
+          <w:p>
+            <w:r/>
+            <w:r>
+              <w:rPr>
+                <w:rFonts w:ascii="Segoe UI" w:hAnsi="Segoe UI"/>
+                <w:b/>
+                <w:color w:val="FFFFFF"/>
+                <w:sz w:val="18"/>
+              </w:rPr>
+              <w:t>Permissions</w:t>
+            </w:r>
+          </w:p>
+        </w:tc>
+      </w:tr>
+      <w:tr>
+        <w:tc>
+          <w:tcPr>
+            <w:tcW w:type="dxa" w:w="4815"/>
+          </w:tcPr>
+          <w:p>
+            <w:r/>
+            <w:r>
+              <w:rPr>
+                <w:rFonts w:ascii="Segoe UI" w:hAnsi="Segoe UI"/>
+                <w:color w:val="2C3E50"/>
+                <w:sz w:val="18"/>
+              </w:rPr>
+              <w:t>operator</w:t>
+            </w:r>
+          </w:p>
+        </w:tc>
+        <w:tc>
+          <w:tcPr>
+            <w:tcW w:type="dxa" w:w="4815"/>
+          </w:tcPr>
+          <w:p>
+            <w:r/>
+            <w:r>
+              <w:rPr>
+                <w:rFonts w:ascii="Segoe UI" w:hAnsi="Segoe UI"/>
+                <w:color w:val="2C3E50"/>
+                <w:sz w:val="18"/>
+              </w:rPr>
+              <w:t>Full access to all operator console features. Cannot access /admin/*.</w:t>
+            </w:r>
+          </w:p>
+        </w:tc>
+      </w:tr>
+      <w:tr>
+        <w:tc>
+          <w:tcPr>
+            <w:tcW w:type="dxa" w:w="4815"/>
+            <w:shd w:fill="F5F7FA" w:val="clear"/>
+          </w:tcPr>
+          <w:p>
+            <w:r/>
+            <w:r>
+              <w:rPr>
+                <w:rFonts w:ascii="Segoe UI" w:hAnsi="Segoe UI"/>
+                <w:color w:val="2C3E50"/>
+                <w:sz w:val="18"/>
+              </w:rPr>
+              <w:t>admin</w:t>
+            </w:r>
+          </w:p>
+        </w:tc>
+        <w:tc>
+          <w:tcPr>
+            <w:tcW w:type="dxa" w:w="4815"/>
+            <w:shd w:fill="F5F7FA" w:val="clear"/>
+          </w:tcPr>
+          <w:p>
+            <w:r/>
+            <w:r>
+              <w:rPr>
+                <w:rFonts w:ascii="Segoe UI" w:hAnsi="Segoe UI"/>
+                <w:color w:val="2C3E50"/>
+                <w:sz w:val="18"/>
+              </w:rPr>
+              <w:t>All operator permissions plus /admin/users account management.</w:t>
+            </w:r>
+          </w:p>
+        </w:tc>
+      </w:tr>
+    </w:tbl>
+    <w:p>
+      <w:pPr>
+        <w:spacing w:before="280" w:after="120"/>
+        <w:pBdr>
+          <w:bottom w:val="single" w:sz="6" w:space="1" w:color="C8A415"/>
+        </w:pBdr>
+      </w:pPr>
+      <w:r>
+        <w:rPr>
+          <w:rFonts w:ascii="Segoe UI" w:hAnsi="Segoe UI"/>
+          <w:b/>
+          <w:color w:val="002244"/>
+          <w:sz w:val="32"/>
+        </w:rPr>
+        <w:t>Creating a User</w:t>
+      </w:r>
+    </w:p>
+    <w:p>
+      <w:r>
+        <w:rPr>
+          <w:rFonts w:ascii="Segoe UI" w:hAnsi="Segoe UI"/>
+          <w:color w:val="2C3E50"/>
+          <w:sz w:val="20"/>
+        </w:rPr>
+        <w:t>At the top of the /admin/users page, complete the Add New User form:</w:t>
+      </w:r>
+    </w:p>
+    <w:p>
+      <w:pPr>
+        <w:spacing w:after="40"/>
+        <w:ind w:left="680"/>
+      </w:pPr>
+      <w:r>
+        <w:rPr>
+          <w:b/>
+          <w:color w:val="00659E"/>
+          <w:sz w:val="20"/>
+        </w:rPr>
+        <w:t xml:space="preserve">• </w:t>
+      </w:r>
+      <w:r>
+        <w:rPr>
+          <w:rFonts w:ascii="Segoe UI" w:hAnsi="Segoe UI"/>
+          <w:color w:val="2C3E50"/>
+          <w:sz w:val="20"/>
+        </w:rPr>
+        <w:t>Username — unique login name, up to 64 characters.</w:t>
+      </w:r>
+    </w:p>
+    <w:p>
+      <w:pPr>
+        <w:spacing w:after="40"/>
+        <w:ind w:left="680"/>
+      </w:pPr>
+      <w:r>
+        <w:rPr>
+          <w:b/>
+          <w:color w:val="00659E"/>
+          <w:sz w:val="20"/>
+        </w:rPr>
+        <w:t xml:space="preserve">• </w:t>
+      </w:r>
+      <w:r>
+        <w:rPr>
+          <w:rFonts w:ascii="Segoe UI" w:hAnsi="Segoe UI"/>
+          <w:color w:val="2C3E50"/>
+          <w:sz w:val="20"/>
+        </w:rPr>
+        <w:t>Password — initial password. The account holder should change this on first login.</w:t>
+      </w:r>
+    </w:p>
+    <w:p>
+      <w:pPr>
+        <w:spacing w:after="40"/>
+        <w:ind w:left="680"/>
+      </w:pPr>
+      <w:r>
+        <w:rPr>
+          <w:b/>
+          <w:color w:val="00659E"/>
+          <w:sz w:val="20"/>
+        </w:rPr>
+        <w:t xml:space="preserve">• </w:t>
+      </w:r>
+      <w:r>
+        <w:rPr>
+          <w:rFonts w:ascii="Segoe UI" w:hAnsi="Segoe UI"/>
+          <w:color w:val="2C3E50"/>
+          <w:sz w:val="20"/>
+        </w:rPr>
+        <w:t>Role — select Operator or Admin.</w:t>
+      </w:r>
+    </w:p>
+    <w:p>
+      <w:r>
+        <w:rPr>
+          <w:rFonts w:ascii="Segoe UI" w:hAnsi="Segoe UI"/>
+          <w:color w:val="2C3E50"/>
+          <w:sz w:val="20"/>
+        </w:rPr>
+        <w:t>Click Create User. The new account appears immediately in the user table below. A confirmation banner confirms success or describes any validation error (e.g. duplicate username).</w:t>
+      </w:r>
+    </w:p>
+    <w:p>
+      <w:pPr>
+        <w:spacing w:before="280" w:after="120"/>
+        <w:pBdr>
+          <w:bottom w:val="single" w:sz="6" w:space="1" w:color="C8A415"/>
+        </w:pBdr>
+      </w:pPr>
+      <w:r>
+        <w:rPr>
+          <w:rFonts w:ascii="Segoe UI" w:hAnsi="Segoe UI"/>
+          <w:b/>
+          <w:color w:val="002244"/>
+          <w:sz w:val="32"/>
+        </w:rPr>
+        <w:t>Editing a User</w:t>
+      </w:r>
+    </w:p>
+    <w:p>
+      <w:r>
+        <w:rPr>
+          <w:rFonts w:ascii="Segoe UI" w:hAnsi="Segoe UI"/>
+          <w:color w:val="2C3E50"/>
+          <w:sz w:val="20"/>
+        </w:rPr>
+        <w:t>Click Edit on any user row to open an inline edit form. Two fields are available:</w:t>
+      </w:r>
+    </w:p>
+    <w:p>
+      <w:pPr>
+        <w:spacing w:after="40"/>
+        <w:ind w:left="680"/>
+      </w:pPr>
+      <w:r>
+        <w:rPr>
+          <w:b/>
+          <w:color w:val="00659E"/>
+          <w:sz w:val="20"/>
+        </w:rPr>
+        <w:t xml:space="preserve">• </w:t>
+      </w:r>
+      <w:r>
+        <w:rPr>
+          <w:rFonts w:ascii="Segoe UI" w:hAnsi="Segoe UI"/>
+          <w:color w:val="2C3E50"/>
+          <w:sz w:val="20"/>
+        </w:rPr>
+        <w:t>Role — change between Operator and Admin.</w:t>
+      </w:r>
+    </w:p>
+    <w:p>
+      <w:pPr>
+        <w:spacing w:after="40"/>
+        <w:ind w:left="680"/>
+      </w:pPr>
+      <w:r>
+        <w:rPr>
+          <w:b/>
+          <w:color w:val="00659E"/>
+          <w:sz w:val="20"/>
+        </w:rPr>
+        <w:t xml:space="preserve">• </w:t>
+      </w:r>
+      <w:r>
+        <w:rPr>
+          <w:rFonts w:ascii="Segoe UI" w:hAnsi="Segoe UI"/>
+          <w:color w:val="2C3E50"/>
+          <w:sz w:val="20"/>
+        </w:rPr>
+        <w:t>New Password — enter a new password to reset it. Leave blank to keep the existing password.</w:t>
+      </w:r>
+    </w:p>
+    <w:p>
+      <w:r>
+        <w:rPr>
+          <w:rFonts w:ascii="Segoe UI" w:hAnsi="Segoe UI"/>
+          <w:color w:val="2C3E50"/>
+          <w:sz w:val="20"/>
+        </w:rPr>
+        <w:t>Click Save to apply changes, or Cancel to discard and return to the display row. Username cannot be changed; create a new account and delete the old one if a username change is required.</w:t>
+      </w:r>
+    </w:p>
+    <w:p>
+      <w:pPr>
+        <w:spacing w:before="280" w:after="120"/>
+        <w:pBdr>
+          <w:bottom w:val="single" w:sz="6" w:space="1" w:color="C8A415"/>
+        </w:pBdr>
+      </w:pPr>
+      <w:r>
+        <w:rPr>
+          <w:rFonts w:ascii="Segoe UI" w:hAnsi="Segoe UI"/>
+          <w:b/>
+          <w:color w:val="002244"/>
+          <w:sz w:val="32"/>
+        </w:rPr>
+        <w:t>Deleting a User</w:t>
+      </w:r>
+    </w:p>
+    <w:p>
+      <w:r>
+        <w:rPr>
+          <w:rFonts w:ascii="Segoe UI" w:hAnsi="Segoe UI"/>
+          <w:color w:val="2C3E50"/>
+          <w:sz w:val="20"/>
+        </w:rPr>
+        <w:t>Click Delete on any user row. A confirmation prompt is shown before the account is permanently removed. The following constraints apply:</w:t>
+      </w:r>
+    </w:p>
+    <w:p>
+      <w:pPr>
+        <w:spacing w:after="40"/>
+        <w:ind w:left="680"/>
+      </w:pPr>
+      <w:r>
+        <w:rPr>
+          <w:b/>
+          <w:color w:val="00659E"/>
+          <w:sz w:val="20"/>
+        </w:rPr>
+        <w:t xml:space="preserve">• </w:t>
+      </w:r>
+      <w:r>
+        <w:rPr>
+          <w:rFonts w:ascii="Segoe UI" w:hAnsi="Segoe UI"/>
+          <w:color w:val="2C3E50"/>
+          <w:sz w:val="20"/>
+        </w:rPr>
+        <w:t>An admin cannot delete their own account.</w:t>
+      </w:r>
+    </w:p>
+    <w:p>
+      <w:pPr>
+        <w:spacing w:after="40"/>
+        <w:ind w:left="680"/>
+      </w:pPr>
+      <w:r>
+        <w:rPr>
+          <w:b/>
+          <w:color w:val="00659E"/>
+          <w:sz w:val="20"/>
+        </w:rPr>
+        <w:t xml:space="preserve">• </w:t>
+      </w:r>
+      <w:r>
+        <w:rPr>
+          <w:rFonts w:ascii="Segoe UI" w:hAnsi="Segoe UI"/>
+          <w:color w:val="2C3E50"/>
+          <w:sz w:val="20"/>
+        </w:rPr>
+        <w:t>An admin cannot delete or demote the last remaining admin account.</w:t>
+      </w:r>
+    </w:p>
+    <w:tbl>
+      <w:tblPr>
+        <w:tblW w:type="auto" w:w="0"/>
+        <w:jc w:val="center"/>
+        <w:tblLook w:firstColumn="1" w:firstRow="1" w:lastColumn="0" w:lastRow="0" w:noHBand="0" w:noVBand="1" w:val="04A0"/>
+      </w:tblPr>
+      <w:tblGrid>
+        <w:gridCol w:w="9630"/>
+      </w:tblGrid>
+      <w:tr>
+        <w:tc>
+          <w:tcPr>
+            <w:tcW w:type="dxa" w:w="9630"/>
+            <w:shd w:fill="FFF9E6" w:val="clear"/>
+            <w:tcBorders>
+              <w:left w:val="single" w:sz="18" w:color="C8A415" w:space="0"/>
+              <w:top w:val="none" w:sz="0" w:space="0" w:color="auto"/>
+              <w:bottom w:val="none" w:sz="0" w:space="0" w:color="auto"/>
+              <w:right w:val="none" w:sz="0" w:space="0" w:color="auto"/>
+            </w:tcBorders>
+          </w:tcPr>
+          <w:p>
+            <w:r/>
+            <w:r>
+              <w:rPr>
+                <w:rFonts w:ascii="Segoe UI" w:hAnsi="Segoe UI"/>
+                <w:i/>
+                <w:color w:val="2C3E50"/>
+                <w:sz w:val="19"/>
+              </w:rPr>
+              <w:t>Deletion is permanent and immediate. There is no soft-delete or recycle bin. Ensure the correct account is selected before confirming.</w:t>
+            </w:r>
+          </w:p>
+        </w:tc>
+      </w:tr>
+    </w:tbl>
+    <w:p>
+      <w:pPr>
+        <w:spacing w:before="280" w:after="120"/>
+        <w:pBdr>
+          <w:bottom w:val="single" w:sz="6" w:space="1" w:color="C8A415"/>
+        </w:pBdr>
+      </w:pPr>
+      <w:r>
+        <w:rPr>
+          <w:rFonts w:ascii="Segoe UI" w:hAnsi="Segoe UI"/>
+          <w:b/>
+          <w:color w:val="002244"/>
+          <w:sz w:val="32"/>
+        </w:rPr>
+        <w:t>Fallback — Direct Database Access</w:t>
+      </w:r>
+    </w:p>
+    <w:p>
+      <w:r>
+        <w:rPr>
+          <w:rFonts w:ascii="Segoe UI" w:hAnsi="Segoe UI"/>
+          <w:color w:val="2C3E50"/>
+          <w:sz w:val="20"/>
+        </w:rPr>
+        <w:t>If all admin accounts are lost (e.g. deleted via direct SQL), access can be restored by stopping the server and either: (a) deleting spectre.db and restarting with SPECTRE_ADMIN_PASS set — this re-runs the bootstrap — or (b) for PostgreSQL, truncating the users table and restarting.</w:t>
+      </w:r>
+    </w:p>
     <w:sectPr>
       <w:headerReference w:type="default" r:id="rId9"/>
       <w:footerReference w:type="default" r:id="rId10"/>

</xml_diff>